<commit_message>
added a dropdown (<select>) in the new शेरा column
</commit_message>
<xml_diff>
--- a/index2/format.docx
+++ b/index2/format.docx
@@ -670,6 +670,7 @@
                 <w:lang w:val="en-IN" w:eastAsia="en-IN" w:bidi="mr-IN"/>
               </w:rPr>
             </w:pPr>
+            <w:proofErr w:type="spellStart"/>
             <w:r>
               <w:rPr>
                 <w:rFonts w:ascii="DVOT-SurekhMR" w:eastAsia="Times New Roman" w:hAnsi="DVOT-SurekhMR" w:cs="DVOT-SurekhMR"/>
@@ -680,8 +681,35 @@
                 <w:szCs w:val="21"/>
                 <w:lang w:val="en-IN" w:eastAsia="en-IN" w:bidi="mr-IN"/>
               </w:rPr>
-              <w:t>खरेदी किंमत</w:t>
+              <w:t>खरेदी</w:t>
             </w:r>
+            <w:proofErr w:type="spellEnd"/>
+            <w:r>
+              <w:rPr>
+                <w:rFonts w:ascii="DVOT-SurekhMR" w:eastAsia="Times New Roman" w:hAnsi="DVOT-SurekhMR" w:cs="DVOT-SurekhMR"/>
+                <w:b/>
+                <w:bCs/>
+                <w:color w:val="000000" w:themeColor="text1"/>
+                <w:sz w:val="21"/>
+                <w:szCs w:val="21"/>
+                <w:lang w:val="en-IN" w:eastAsia="en-IN" w:bidi="mr-IN"/>
+              </w:rPr>
+              <w:t xml:space="preserve"> </w:t>
+            </w:r>
+            <w:proofErr w:type="spellStart"/>
+            <w:r>
+              <w:rPr>
+                <w:rFonts w:ascii="DVOT-SurekhMR" w:eastAsia="Times New Roman" w:hAnsi="DVOT-SurekhMR" w:cs="DVOT-SurekhMR"/>
+                <w:b/>
+                <w:bCs/>
+                <w:color w:val="000000" w:themeColor="text1"/>
+                <w:sz w:val="21"/>
+                <w:szCs w:val="21"/>
+                <w:lang w:val="en-IN" w:eastAsia="en-IN" w:bidi="mr-IN"/>
+              </w:rPr>
+              <w:t>किंमत</w:t>
+            </w:r>
+            <w:proofErr w:type="spellEnd"/>
           </w:p>
         </w:tc>
         <w:tc>
@@ -919,6 +947,7 @@
                 <w:lang w:val="en-IN" w:eastAsia="en-IN" w:bidi="mr-IN"/>
               </w:rPr>
             </w:pPr>
+            <w:proofErr w:type="spellStart"/>
             <w:r>
               <w:rPr>
                 <w:rFonts w:ascii="DVOT-SurekhMR" w:eastAsia="Times New Roman" w:hAnsi="DVOT-SurekhMR" w:cs="DVOT-SurekhMR"/>
@@ -927,10 +956,64 @@
                 <w:color w:val="000000" w:themeColor="text1"/>
                 <w:sz w:val="21"/>
                 <w:szCs w:val="21"/>
-                <w:lang w:eastAsia="en-IN" w:bidi="mr-IN"/>
-              </w:rPr>
-              <w:t>प्रकार</w:t>
+                <w:lang w:val="en-IN" w:eastAsia="en-IN" w:bidi="mr-IN"/>
+              </w:rPr>
+              <w:t>मोब</w:t>
             </w:r>
+            <w:proofErr w:type="spellEnd"/>
+            <w:r>
+              <w:rPr>
+                <w:rFonts w:ascii="DVOT-SurekhMR" w:eastAsia="Times New Roman" w:hAnsi="DVOT-SurekhMR" w:cs="DVOT-SurekhMR" w:hint="cs"/>
+                <w:b/>
+                <w:bCs/>
+                <w:color w:val="000000" w:themeColor="text1"/>
+                <w:sz w:val="21"/>
+                <w:szCs w:val="21"/>
+                <w:cs/>
+                <w:lang w:val="en-IN" w:eastAsia="en-IN" w:bidi="mr-IN"/>
+              </w:rPr>
+              <w:t>द</w:t>
+            </w:r>
+            <w:proofErr w:type="spellStart"/>
+            <w:r>
+              <w:rPr>
+                <w:rFonts w:ascii="DVOT-SurekhMR" w:eastAsia="Times New Roman" w:hAnsi="DVOT-SurekhMR" w:cs="DVOT-SurekhMR"/>
+                <w:b/>
+                <w:bCs/>
+                <w:color w:val="000000" w:themeColor="text1"/>
+                <w:sz w:val="21"/>
+                <w:szCs w:val="21"/>
+                <w:lang w:val="en-IN" w:eastAsia="en-IN" w:bidi="mr-IN"/>
+              </w:rPr>
+              <w:t>ला</w:t>
+            </w:r>
+            <w:proofErr w:type="spellEnd"/>
+            <w:r>
+              <w:rPr>
+                <w:rFonts w:ascii="DVOT-SurekhMR" w:eastAsia="Times New Roman" w:hAnsi="DVOT-SurekhMR" w:cs="DVOT-SurekhMR"/>
+                <w:b/>
+                <w:bCs/>
+                <w:color w:val="000000" w:themeColor="text1"/>
+                <w:sz w:val="21"/>
+                <w:szCs w:val="21"/>
+                <w:lang w:val="en-IN" w:eastAsia="en-IN" w:bidi="mr-IN"/>
+              </w:rPr>
+              <w:t xml:space="preserve"> </w:t>
+            </w:r>
+            <w:proofErr w:type="spellStart"/>
+            <w:r>
+              <w:rPr>
+                <w:rFonts w:ascii="DVOT-SurekhMR" w:eastAsia="Times New Roman" w:hAnsi="DVOT-SurekhMR" w:cs="DVOT-SurekhMR"/>
+                <w:b/>
+                <w:bCs/>
+                <w:color w:val="000000" w:themeColor="text1"/>
+                <w:sz w:val="21"/>
+                <w:szCs w:val="21"/>
+                <w:lang w:val="en-IN" w:eastAsia="en-IN" w:bidi="mr-IN"/>
+              </w:rPr>
+              <w:t>रक्कम</w:t>
+            </w:r>
+            <w:proofErr w:type="spellEnd"/>
           </w:p>
         </w:tc>
         <w:tc>
@@ -957,6 +1040,7 @@
                 <w:lang w:val="en-IN" w:eastAsia="en-IN" w:bidi="mr-IN"/>
               </w:rPr>
             </w:pPr>
+            <w:proofErr w:type="spellStart"/>
             <w:r>
               <w:rPr>
                 <w:rFonts w:ascii="DVOT-SurekhMR" w:eastAsia="Times New Roman" w:hAnsi="DVOT-SurekhMR" w:cs="DVOT-SurekhMR"/>
@@ -967,33 +1051,9 @@
                 <w:szCs w:val="21"/>
                 <w:lang w:val="en-IN" w:eastAsia="en-IN" w:bidi="mr-IN"/>
               </w:rPr>
-              <w:t>मोब</w:t>
+              <w:t>शेरा</w:t>
             </w:r>
-            <w:r>
-              <w:rPr>
-                <w:rFonts w:ascii="DVOT-SurekhMR" w:eastAsia="Times New Roman" w:hAnsi="DVOT-SurekhMR" w:cs="DVOT-SurekhMR"/>
-                <w:b/>
-                <w:bCs/>
-                <w:color w:val="000000" w:themeColor="text1"/>
-                <w:sz w:val="21"/>
-                <w:szCs w:val="21"/>
-                <w:cs/>
-                <w:lang w:val="en-IN" w:eastAsia="en-IN" w:bidi="mr-IN"/>
-              </w:rPr>
-              <w:t>द</w:t>
-            </w:r>
-            <w:r>
-              <w:rPr>
-                <w:rFonts w:ascii="DVOT-SurekhMR" w:eastAsia="Times New Roman" w:hAnsi="DVOT-SurekhMR" w:cs="DVOT-SurekhMR"/>
-                <w:b/>
-                <w:bCs/>
-                <w:color w:val="000000" w:themeColor="text1"/>
-                <w:sz w:val="21"/>
-                <w:szCs w:val="21"/>
-                <w:lang w:val="en-IN" w:eastAsia="en-IN" w:bidi="mr-IN"/>
-              </w:rPr>
-              <w:t>ला रक्कम</w:t>
-            </w:r>
+            <w:proofErr w:type="spellEnd"/>
           </w:p>
         </w:tc>
       </w:tr>
@@ -6474,6 +6534,7 @@
   <w:style w:type="character" w:default="1" w:styleId="DefaultParagraphFont">
     <w:name w:val="Default Paragraph Font"/>
     <w:uiPriority w:val="1"/>
+    <w:semiHidden/>
     <w:unhideWhenUsed/>
   </w:style>
   <w:style w:type="table" w:default="1" w:styleId="TableNormal">

</xml_diff>